<commit_message>
Align Part 2 features with Part 3 requirements
Align Part 2 features with Part 3 requirements
</commit_message>
<xml_diff>
--- a/part2_python/Part_2_Python_Report.docx
+++ b/part2_python/Part_2_Python_Report.docx
@@ -366,11 +366,11 @@
         <w:t xml:space="preserve">feature_engineering.py </w:t>
       </w:r>
       <w:r>
-        <w:t xml:space="preserve">consolidates the 48,187 cleaned records into 40,575 unique hourly observations and expands the dataset from 9 to 32 variables. Time features include hour, day of week, month, year, weekend/day-type indicators, traffic period and cyclical hour encoding. Eleven </w:t>
+        <w:t xml:space="preserve">consolidates the 48,187 cleaned records into 40,575 unique hourly observations and expands the dataset from 9 to 36 variables. Time features include hour, day of week, month, year, weekend/day-type indicators, traffic period, and sine and cosine cyclical </w:t>
       </w:r>
       <w:r>
         <w:lastRenderedPageBreak/>
-        <w:t xml:space="preserve">binary weather indicators preserve the weather conditions reported at each timestamp, while temperature, cloud coverage and traffic volume are also </w:t>
+        <w:t xml:space="preserve">encodings of both hour and day of week. A whole-day holiday indicator is derived from the recorded holiday dates. Eleven binary weather indicators preserve the weather conditions reported at each timestamp, while temperature, cloud coverage and traffic volume are also </w:t>
       </w:r>
       <w:proofErr w:type="spellStart"/>
       <w:r>
@@ -383,10 +383,7 @@
     </w:p>
     <w:p>
       <w:r>
-        <w:t>A three-level congestion target was derived from traffic-volume quartiles: Low (≤1,248.5 vehicles), Moderate (&gt;1,248.5 to ≤4,952) and High (&gt;4,952). This produced 10,144 Low, 20,289 Moderate and 10,142 High observations</w:t>
-      </w:r>
-      <w:r>
-        <w:t>.</w:t>
+        <w:t>A four-level congestion target was derived from traffic-volume quartiles: Low (≤1,248.5 vehicles), Medium (&gt;1,248.5 to ≤3,427), High (&gt;3,427 to ≤4,952) and Severe (&gt;4,952). This produced 10,144 Low, 10,144 Medium, 10,145 High and 10,142 Severe observations.</w:t>
       </w:r>
     </w:p>
     <w:p>
@@ -399,7 +396,7 @@
       </w:r>
       <w:proofErr w:type="spellEnd"/>
       <w:r>
-        <w:t xml:space="preserve">. Hour and day-type variables capture recurring commuting patterns, while cyclical encoding represents the periodic nature of time without treating the end and beginning of the day as unrelated. Weather indicators preserve the potentially overlapping conditions recorded at each timestamp, and </w:t>
+        <w:t xml:space="preserve">. Hour, day-of-week and day-type variables capture recurring temporal and commuting patterns, while sine and cosine cyclical encodings of both hour and day of week represent their periodic nature without treating adjacent periods across cycle boundaries as unrelated. A whole-day holiday indicator identifies observations occurring on recorded holiday dates. Weather indicators preserve the potentially overlapping conditions recorded at each timestamp, and </w:t>
       </w:r>
       <w:proofErr w:type="spellStart"/>
       <w:r>
@@ -407,7 +404,7 @@
       </w:r>
       <w:proofErr w:type="spellEnd"/>
       <w:r>
-        <w:t xml:space="preserve"> numerical variables place continuous features on comparable scales for subsequent machine-learning algorithms. The congestion category also provides a categorical representation of traffic intensity that can be used in later classification tasks.</w:t>
+        <w:t xml:space="preserve"> numerical variables place continuous features on comparable scales for subsequent machine-learning algorithms. The four-level congestion category provides a categorical representation of traffic intensity that can be used in subsequent machine-learning analyses.</w:t>
       </w:r>
     </w:p>
     <w:p>
@@ -427,13 +424,13 @@
         <mc:AlternateContent>
           <mc:Choice Requires="wps">
             <w:drawing>
-              <wp:anchor distT="0" distB="0" distL="114300" distR="114300" simplePos="0" relativeHeight="251661312" behindDoc="0" locked="0" layoutInCell="1" allowOverlap="1" wp14:anchorId="39EAED43" wp14:editId="5B56C9CB">
+              <wp:anchor distT="0" distB="0" distL="114300" distR="114300" simplePos="0" relativeHeight="251661312" behindDoc="0" locked="0" layoutInCell="1" allowOverlap="1" wp14:anchorId="39EAED43" wp14:editId="13DF1F62">
                 <wp:simplePos x="0" y="0"/>
                 <wp:positionH relativeFrom="column">
-                  <wp:posOffset>3114136</wp:posOffset>
+                  <wp:posOffset>2723515</wp:posOffset>
                 </wp:positionH>
                 <wp:positionV relativeFrom="paragraph">
-                  <wp:posOffset>1692467</wp:posOffset>
+                  <wp:posOffset>1532890</wp:posOffset>
                 </wp:positionV>
                 <wp:extent cx="2562045" cy="439947"/>
                 <wp:effectExtent l="0" t="0" r="0" b="0"/>
@@ -489,7 +486,7 @@
                 <v:stroke joinstyle="miter"/>
                 <v:path gradientshapeok="t" o:connecttype="rect"/>
               </v:shapetype>
-              <v:shape id="Text Box 1" o:spid="_x0000_s1026" type="#_x0000_t202" style="position:absolute;margin-left:245.2pt;margin-top:133.25pt;width:201.75pt;height:34.65pt;z-index:251661312;visibility:visible;mso-wrap-style:square;mso-height-percent:0;mso-wrap-distance-left:9pt;mso-wrap-distance-top:0;mso-wrap-distance-right:9pt;mso-wrap-distance-bottom:0;mso-position-horizontal:absolute;mso-position-horizontal-relative:text;mso-position-vertical:absolute;mso-position-vertical-relative:text;mso-height-percent:0;mso-height-relative:margin;v-text-anchor:top" o:gfxdata="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" fillcolor="white [3201]" stroked="f" strokeweight=".5pt">
+              <v:shape id="Text Box 1" o:spid="_x0000_s1026" type="#_x0000_t202" style="position:absolute;margin-left:214.45pt;margin-top:120.7pt;width:201.75pt;height:34.65pt;z-index:251661312;visibility:visible;mso-wrap-style:square;mso-height-percent:0;mso-wrap-distance-left:9pt;mso-wrap-distance-top:0;mso-wrap-distance-right:9pt;mso-wrap-distance-bottom:0;mso-position-horizontal:absolute;mso-position-horizontal-relative:text;mso-position-vertical:absolute;mso-position-vertical-relative:text;mso-height-percent:0;mso-height-relative:margin;v-text-anchor:top" o:gfxdata="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" fillcolor="white [3201]" stroked="f" strokeweight=".5pt">
                 <v:textbox>
                   <w:txbxContent>
                     <w:p>
@@ -512,15 +509,15 @@
         <mc:AlternateContent>
           <mc:Choice Requires="wps">
             <w:drawing>
-              <wp:anchor distT="0" distB="0" distL="114300" distR="114300" simplePos="0" relativeHeight="251659264" behindDoc="0" locked="0" layoutInCell="1" allowOverlap="1" wp14:anchorId="63211613" wp14:editId="0559CBC7">
+              <wp:anchor distT="0" distB="0" distL="114300" distR="114300" simplePos="0" relativeHeight="251659264" behindDoc="0" locked="0" layoutInCell="1" allowOverlap="1" wp14:anchorId="63211613" wp14:editId="1861CE85">
                 <wp:simplePos x="0" y="0"/>
                 <wp:positionH relativeFrom="column">
-                  <wp:posOffset>284672</wp:posOffset>
+                  <wp:posOffset>74930</wp:posOffset>
                 </wp:positionH>
                 <wp:positionV relativeFrom="paragraph">
-                  <wp:posOffset>1714428</wp:posOffset>
+                  <wp:posOffset>1545590</wp:posOffset>
                 </wp:positionV>
-                <wp:extent cx="2562045" cy="439947"/>
+                <wp:extent cx="2561590" cy="439420"/>
                 <wp:effectExtent l="0" t="0" r="0" b="0"/>
                 <wp:wrapNone/>
                 <wp:docPr id="610041070" name="Text Box 1"/>
@@ -532,7 +529,7 @@
                       <wps:spPr>
                         <a:xfrm>
                           <a:off x="0" y="0"/>
-                          <a:ext cx="2562045" cy="439947"/>
+                          <a:ext cx="2561590" cy="439420"/>
                         </a:xfrm>
                         <a:prstGeom prst="rect">
                           <a:avLst/>
@@ -570,7 +567,7 @@
           </mc:Choice>
           <mc:Fallback>
             <w:pict>
-              <v:shape w14:anchorId="63211613" id="_x0000_s1027" type="#_x0000_t202" style="position:absolute;margin-left:22.4pt;margin-top:135pt;width:201.75pt;height:34.65pt;z-index:251659264;visibility:visible;mso-wrap-style:square;mso-height-percent:0;mso-wrap-distance-left:9pt;mso-wrap-distance-top:0;mso-wrap-distance-right:9pt;mso-wrap-distance-bottom:0;mso-position-horizontal:absolute;mso-position-horizontal-relative:text;mso-position-vertical:absolute;mso-position-vertical-relative:text;mso-height-percent:0;mso-height-relative:margin;v-text-anchor:top" o:gfxdata="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" fillcolor="white [3201]" stroked="f" strokeweight=".5pt">
+              <v:shape w14:anchorId="63211613" id="_x0000_s1027" type="#_x0000_t202" style="position:absolute;margin-left:5.9pt;margin-top:121.7pt;width:201.7pt;height:34.6pt;z-index:251659264;visibility:visible;mso-wrap-style:square;mso-height-percent:0;mso-wrap-distance-left:9pt;mso-wrap-distance-top:0;mso-wrap-distance-right:9pt;mso-wrap-distance-bottom:0;mso-position-horizontal:absolute;mso-position-horizontal-relative:text;mso-position-vertical:absolute;mso-position-vertical-relative:text;mso-height-percent:0;mso-height-relative:margin;v-text-anchor:top" o:gfxdata="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" fillcolor="white [3201]" stroked="f" strokeweight=".5pt">
                 <v:textbox>
                   <w:txbxContent>
                     <w:p>
@@ -586,9 +583,12 @@
         </mc:AlternateContent>
       </w:r>
       <w:r>
+        <w:rPr>
+          <w:noProof/>
+        </w:rPr>
         <w:drawing>
-          <wp:inline distT="0" distB="0" distL="0" distR="0" wp14:anchorId="7627EA68" wp14:editId="74588207">
-            <wp:extent cx="2879527" cy="1714764"/>
+          <wp:inline distT="0" distB="0" distL="0" distR="0" wp14:anchorId="3ED8F10A" wp14:editId="32DD4AD0">
+            <wp:extent cx="2592000" cy="1544400"/>
             <wp:effectExtent l="0" t="0" r="0" b="0"/>
             <wp:docPr id="1759623453" name="Picture 1"/>
             <wp:cNvGraphicFramePr>
@@ -610,7 +610,7 @@
                   <pic:spPr>
                     <a:xfrm>
                       <a:off x="0" y="0"/>
-                      <a:ext cx="2905014" cy="1729941"/>
+                      <a:ext cx="2592000" cy="1544400"/>
                     </a:xfrm>
                     <a:prstGeom prst="rect">
                       <a:avLst/>
@@ -623,10 +623,13 @@
         </w:drawing>
       </w:r>
       <w:r>
+        <w:rPr>
+          <w:noProof/>
+        </w:rPr>
         <w:drawing>
-          <wp:inline distT="0" distB="0" distL="0" distR="0" wp14:anchorId="4E9834D7" wp14:editId="3A3855BF">
-            <wp:extent cx="2829464" cy="1684325"/>
-            <wp:effectExtent l="0" t="0" r="9525" b="0"/>
+          <wp:inline distT="0" distB="0" distL="0" distR="0" wp14:anchorId="4E9834D7" wp14:editId="0E3518CE">
+            <wp:extent cx="2545200" cy="1515600"/>
+            <wp:effectExtent l="0" t="0" r="7620" b="8890"/>
             <wp:docPr id="1753040495" name="Picture 1"/>
             <wp:cNvGraphicFramePr>
               <a:graphicFrameLocks xmlns:a="http://schemas.openxmlformats.org/drawingml/2006/main" noChangeAspect="1"/>
@@ -647,7 +650,7 @@
                   <pic:spPr>
                     <a:xfrm>
                       <a:off x="0" y="0"/>
-                      <a:ext cx="2850701" cy="1696967"/>
+                      <a:ext cx="2545200" cy="1515600"/>
                     </a:xfrm>
                     <a:prstGeom prst="rect">
                       <a:avLst/>
@@ -663,82 +666,6 @@
     <w:p/>
     <w:p>
       <w:r>
-        <w:drawing>
-          <wp:inline distT="0" distB="0" distL="0" distR="0" wp14:anchorId="5ABBFE20" wp14:editId="6CAA2D7A">
-            <wp:extent cx="2843657" cy="1694348"/>
-            <wp:effectExtent l="0" t="0" r="0" b="1270"/>
-            <wp:docPr id="2101450168" name="Picture 1"/>
-            <wp:cNvGraphicFramePr>
-              <a:graphicFrameLocks xmlns:a="http://schemas.openxmlformats.org/drawingml/2006/main" noChangeAspect="1"/>
-            </wp:cNvGraphicFramePr>
-            <a:graphic xmlns:a="http://schemas.openxmlformats.org/drawingml/2006/main">
-              <a:graphicData uri="http://schemas.openxmlformats.org/drawingml/2006/picture">
-                <pic:pic xmlns:pic="http://schemas.openxmlformats.org/drawingml/2006/picture">
-                  <pic:nvPicPr>
-                    <pic:cNvPr id="2101450168" name=""/>
-                    <pic:cNvPicPr/>
-                  </pic:nvPicPr>
-                  <pic:blipFill>
-                    <a:blip r:embed="rId7"/>
-                    <a:stretch>
-                      <a:fillRect/>
-                    </a:stretch>
-                  </pic:blipFill>
-                  <pic:spPr>
-                    <a:xfrm>
-                      <a:off x="0" y="0"/>
-                      <a:ext cx="2865818" cy="1707552"/>
-                    </a:xfrm>
-                    <a:prstGeom prst="rect">
-                      <a:avLst/>
-                    </a:prstGeom>
-                  </pic:spPr>
-                </pic:pic>
-              </a:graphicData>
-            </a:graphic>
-          </wp:inline>
-        </w:drawing>
-      </w:r>
-      <w:r>
-        <w:drawing>
-          <wp:inline distT="0" distB="0" distL="0" distR="0" wp14:anchorId="22D561D3" wp14:editId="129BCE10">
-            <wp:extent cx="2881223" cy="1719923"/>
-            <wp:effectExtent l="0" t="0" r="0" b="0"/>
-            <wp:docPr id="2063170683" name="Picture 1"/>
-            <wp:cNvGraphicFramePr>
-              <a:graphicFrameLocks xmlns:a="http://schemas.openxmlformats.org/drawingml/2006/main" noChangeAspect="1"/>
-            </wp:cNvGraphicFramePr>
-            <a:graphic xmlns:a="http://schemas.openxmlformats.org/drawingml/2006/main">
-              <a:graphicData uri="http://schemas.openxmlformats.org/drawingml/2006/picture">
-                <pic:pic xmlns:pic="http://schemas.openxmlformats.org/drawingml/2006/picture">
-                  <pic:nvPicPr>
-                    <pic:cNvPr id="2063170683" name=""/>
-                    <pic:cNvPicPr/>
-                  </pic:nvPicPr>
-                  <pic:blipFill>
-                    <a:blip r:embed="rId8"/>
-                    <a:stretch>
-                      <a:fillRect/>
-                    </a:stretch>
-                  </pic:blipFill>
-                  <pic:spPr>
-                    <a:xfrm>
-                      <a:off x="0" y="0"/>
-                      <a:ext cx="2924274" cy="1745622"/>
-                    </a:xfrm>
-                    <a:prstGeom prst="rect">
-                      <a:avLst/>
-                    </a:prstGeom>
-                  </pic:spPr>
-                </pic:pic>
-              </a:graphicData>
-            </a:graphic>
-          </wp:inline>
-        </w:drawing>
-      </w:r>
-    </w:p>
-    <w:p>
-      <w:r>
         <w:rPr>
           <w:noProof/>
           <w14:ligatures w14:val="standardContextual"/>
@@ -746,13 +673,94 @@
         <mc:AlternateContent>
           <mc:Choice Requires="wps">
             <w:drawing>
-              <wp:anchor distT="0" distB="0" distL="114300" distR="114300" simplePos="0" relativeHeight="251663360" behindDoc="0" locked="0" layoutInCell="1" allowOverlap="1" wp14:anchorId="328F5E04" wp14:editId="5124B3A3">
+              <wp:anchor distT="0" distB="0" distL="114300" distR="114300" simplePos="0" relativeHeight="251665408" behindDoc="0" locked="0" layoutInCell="1" allowOverlap="1" wp14:anchorId="20D494C6" wp14:editId="01B88216">
                 <wp:simplePos x="0" y="0"/>
                 <wp:positionH relativeFrom="column">
-                  <wp:posOffset>258793</wp:posOffset>
+                  <wp:posOffset>2678430</wp:posOffset>
                 </wp:positionH>
                 <wp:positionV relativeFrom="paragraph">
-                  <wp:posOffset>8626</wp:posOffset>
+                  <wp:posOffset>1529080</wp:posOffset>
+                </wp:positionV>
+                <wp:extent cx="2562045" cy="439947"/>
+                <wp:effectExtent l="0" t="0" r="0" b="0"/>
+                <wp:wrapNone/>
+                <wp:docPr id="152469810" name="Text Box 1"/>
+                <wp:cNvGraphicFramePr/>
+                <a:graphic xmlns:a="http://schemas.openxmlformats.org/drawingml/2006/main">
+                  <a:graphicData uri="http://schemas.microsoft.com/office/word/2010/wordprocessingShape">
+                    <wps:wsp>
+                      <wps:cNvSpPr txBox="1"/>
+                      <wps:spPr>
+                        <a:xfrm>
+                          <a:off x="0" y="0"/>
+                          <a:ext cx="2562045" cy="439947"/>
+                        </a:xfrm>
+                        <a:prstGeom prst="rect">
+                          <a:avLst/>
+                        </a:prstGeom>
+                        <a:solidFill>
+                          <a:schemeClr val="lt1"/>
+                        </a:solidFill>
+                        <a:ln w="6350">
+                          <a:noFill/>
+                        </a:ln>
+                      </wps:spPr>
+                      <wps:txbx>
+                        <w:txbxContent>
+                          <w:p>
+                            <w:r>
+                              <w:t>Figure 4. Congestion category by hour of day</w:t>
+                            </w:r>
+                          </w:p>
+                        </w:txbxContent>
+                      </wps:txbx>
+                      <wps:bodyPr rot="0" spcFirstLastPara="0" vertOverflow="overflow" horzOverflow="overflow" vert="horz" wrap="square" lIns="91440" tIns="45720" rIns="91440" bIns="45720" numCol="1" spcCol="0" rtlCol="0" fromWordArt="0" anchor="t" anchorCtr="0" forceAA="0" compatLnSpc="1">
+                        <a:prstTxWarp prst="textNoShape">
+                          <a:avLst/>
+                        </a:prstTxWarp>
+                        <a:noAutofit/>
+                      </wps:bodyPr>
+                    </wps:wsp>
+                  </a:graphicData>
+                </a:graphic>
+                <wp14:sizeRelV relativeFrom="margin">
+                  <wp14:pctHeight>0</wp14:pctHeight>
+                </wp14:sizeRelV>
+              </wp:anchor>
+            </w:drawing>
+          </mc:Choice>
+          <mc:Fallback>
+            <w:pict>
+              <v:shape w14:anchorId="20D494C6" id="_x0000_s1028" type="#_x0000_t202" style="position:absolute;margin-left:210.9pt;margin-top:120.4pt;width:201.75pt;height:34.65pt;z-index:251665408;visibility:visible;mso-wrap-style:square;mso-height-percent:0;mso-wrap-distance-left:9pt;mso-wrap-distance-top:0;mso-wrap-distance-right:9pt;mso-wrap-distance-bottom:0;mso-position-horizontal:absolute;mso-position-horizontal-relative:text;mso-position-vertical:absolute;mso-position-vertical-relative:text;mso-height-percent:0;mso-height-relative:margin;v-text-anchor:top" o:gfxdata="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" fillcolor="white [3201]" stroked="f" strokeweight=".5pt">
+                <v:textbox>
+                  <w:txbxContent>
+                    <w:p>
+                      <w:r>
+                        <w:t>Figure 4. Congestion category by hour of day</w:t>
+                      </w:r>
+                    </w:p>
+                  </w:txbxContent>
+                </v:textbox>
+              </v:shape>
+            </w:pict>
+          </mc:Fallback>
+        </mc:AlternateContent>
+      </w:r>
+      <w:r>
+        <w:rPr>
+          <w:noProof/>
+          <w14:ligatures w14:val="standardContextual"/>
+        </w:rPr>
+        <mc:AlternateContent>
+          <mc:Choice Requires="wps">
+            <w:drawing>
+              <wp:anchor distT="0" distB="0" distL="114300" distR="114300" simplePos="0" relativeHeight="251663360" behindDoc="0" locked="0" layoutInCell="1" allowOverlap="1" wp14:anchorId="328F5E04" wp14:editId="60B1DA4B">
+                <wp:simplePos x="0" y="0"/>
+                <wp:positionH relativeFrom="column">
+                  <wp:posOffset>49530</wp:posOffset>
+                </wp:positionH>
+                <wp:positionV relativeFrom="paragraph">
+                  <wp:posOffset>1542415</wp:posOffset>
                 </wp:positionV>
                 <wp:extent cx="2562045" cy="439947"/>
                 <wp:effectExtent l="0" t="0" r="0" b="0"/>
@@ -804,7 +812,7 @@
           </mc:Choice>
           <mc:Fallback>
             <w:pict>
-              <v:shape w14:anchorId="328F5E04" id="_x0000_s1028" type="#_x0000_t202" style="position:absolute;margin-left:20.4pt;margin-top:.7pt;width:201.75pt;height:34.65pt;z-index:251663360;visibility:visible;mso-wrap-style:square;mso-height-percent:0;mso-wrap-distance-left:9pt;mso-wrap-distance-top:0;mso-wrap-distance-right:9pt;mso-wrap-distance-bottom:0;mso-position-horizontal:absolute;mso-position-horizontal-relative:text;mso-position-vertical:absolute;mso-position-vertical-relative:text;mso-height-percent:0;mso-height-relative:margin;v-text-anchor:top" o:gfxdata="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" fillcolor="white [3201]" stroked="f" strokeweight=".5pt">
+              <v:shape w14:anchorId="328F5E04" id="_x0000_s1029" type="#_x0000_t202" style="position:absolute;margin-left:3.9pt;margin-top:121.45pt;width:201.75pt;height:34.65pt;z-index:251663360;visibility:visible;mso-wrap-style:square;mso-height-percent:0;mso-wrap-distance-left:9pt;mso-wrap-distance-top:0;mso-wrap-distance-right:9pt;mso-wrap-distance-bottom:0;mso-position-horizontal:absolute;mso-position-horizontal-relative:text;mso-position-vertical:absolute;mso-position-vertical-relative:text;mso-height-percent:0;mso-height-relative:margin;v-text-anchor:top" o:gfxdata="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" fillcolor="white [3201]" stroked="f" strokeweight=".5pt">
                 <v:textbox>
                   <w:txbxContent>
                     <w:p>
@@ -822,83 +830,101 @@
       <w:r>
         <w:rPr>
           <w:noProof/>
-          <w14:ligatures w14:val="standardContextual"/>
         </w:rPr>
-        <mc:AlternateContent>
-          <mc:Choice Requires="wps">
-            <w:drawing>
-              <wp:anchor distT="0" distB="0" distL="114300" distR="114300" simplePos="0" relativeHeight="251665408" behindDoc="0" locked="0" layoutInCell="1" allowOverlap="1" wp14:anchorId="20D494C6" wp14:editId="3AE168B4">
-                <wp:simplePos x="0" y="0"/>
-                <wp:positionH relativeFrom="column">
-                  <wp:posOffset>3088257</wp:posOffset>
-                </wp:positionH>
-                <wp:positionV relativeFrom="paragraph">
-                  <wp:posOffset>12400</wp:posOffset>
-                </wp:positionV>
-                <wp:extent cx="2562045" cy="439947"/>
-                <wp:effectExtent l="0" t="0" r="0" b="0"/>
-                <wp:wrapNone/>
-                <wp:docPr id="152469810" name="Text Box 1"/>
-                <wp:cNvGraphicFramePr/>
-                <a:graphic xmlns:a="http://schemas.openxmlformats.org/drawingml/2006/main">
-                  <a:graphicData uri="http://schemas.microsoft.com/office/word/2010/wordprocessingShape">
-                    <wps:wsp>
-                      <wps:cNvSpPr txBox="1"/>
-                      <wps:spPr>
-                        <a:xfrm>
-                          <a:off x="0" y="0"/>
-                          <a:ext cx="2562045" cy="439947"/>
-                        </a:xfrm>
-                        <a:prstGeom prst="rect">
-                          <a:avLst/>
-                        </a:prstGeom>
-                        <a:solidFill>
-                          <a:schemeClr val="lt1"/>
-                        </a:solidFill>
-                        <a:ln w="6350">
-                          <a:noFill/>
-                        </a:ln>
-                      </wps:spPr>
-                      <wps:txbx>
-                        <w:txbxContent>
-                          <w:p>
-                            <w:r>
-                              <w:t>Figure 4. Congestion category by hour of day</w:t>
-                            </w:r>
-                          </w:p>
-                        </w:txbxContent>
-                      </wps:txbx>
-                      <wps:bodyPr rot="0" spcFirstLastPara="0" vertOverflow="overflow" horzOverflow="overflow" vert="horz" wrap="square" lIns="91440" tIns="45720" rIns="91440" bIns="45720" numCol="1" spcCol="0" rtlCol="0" fromWordArt="0" anchor="t" anchorCtr="0" forceAA="0" compatLnSpc="1">
-                        <a:prstTxWarp prst="textNoShape">
-                          <a:avLst/>
-                        </a:prstTxWarp>
-                        <a:noAutofit/>
-                      </wps:bodyPr>
-                    </wps:wsp>
-                  </a:graphicData>
-                </a:graphic>
-                <wp14:sizeRelV relativeFrom="margin">
-                  <wp14:pctHeight>0</wp14:pctHeight>
-                </wp14:sizeRelV>
-              </wp:anchor>
-            </w:drawing>
-          </mc:Choice>
-          <mc:Fallback>
-            <w:pict>
-              <v:shape w14:anchorId="20D494C6" id="_x0000_s1029" type="#_x0000_t202" style="position:absolute;margin-left:243.15pt;margin-top:1pt;width:201.75pt;height:34.65pt;z-index:251665408;visibility:visible;mso-wrap-style:square;mso-height-percent:0;mso-wrap-distance-left:9pt;mso-wrap-distance-top:0;mso-wrap-distance-right:9pt;mso-wrap-distance-bottom:0;mso-position-horizontal:absolute;mso-position-horizontal-relative:text;mso-position-vertical:absolute;mso-position-vertical-relative:text;mso-height-percent:0;mso-height-relative:margin;v-text-anchor:top" o:gfxdata="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" fillcolor="white [3201]" stroked="f" strokeweight=".5pt">
-                <v:textbox>
-                  <w:txbxContent>
-                    <w:p>
-                      <w:r>
-                        <w:t>Figure 4. Congestion category by hour of day</w:t>
-                      </w:r>
-                    </w:p>
-                  </w:txbxContent>
-                </v:textbox>
-              </v:shape>
-            </w:pict>
-          </mc:Fallback>
-        </mc:AlternateContent>
+        <w:drawing>
+          <wp:inline distT="0" distB="0" distL="0" distR="0" wp14:anchorId="5ABBFE20" wp14:editId="5D27B5A9">
+            <wp:extent cx="2563200" cy="1526400"/>
+            <wp:effectExtent l="0" t="0" r="8890" b="0"/>
+            <wp:docPr id="2101450168" name="Picture 1"/>
+            <wp:cNvGraphicFramePr>
+              <a:graphicFrameLocks xmlns:a="http://schemas.openxmlformats.org/drawingml/2006/main" noChangeAspect="1"/>
+            </wp:cNvGraphicFramePr>
+            <a:graphic xmlns:a="http://schemas.openxmlformats.org/drawingml/2006/main">
+              <a:graphicData uri="http://schemas.openxmlformats.org/drawingml/2006/picture">
+                <pic:pic xmlns:pic="http://schemas.openxmlformats.org/drawingml/2006/picture">
+                  <pic:nvPicPr>
+                    <pic:cNvPr id="2101450168" name=""/>
+                    <pic:cNvPicPr/>
+                  </pic:nvPicPr>
+                  <pic:blipFill>
+                    <a:blip r:embed="rId7"/>
+                    <a:stretch>
+                      <a:fillRect/>
+                    </a:stretch>
+                  </pic:blipFill>
+                  <pic:spPr>
+                    <a:xfrm>
+                      <a:off x="0" y="0"/>
+                      <a:ext cx="2563200" cy="1526400"/>
+                    </a:xfrm>
+                    <a:prstGeom prst="rect">
+                      <a:avLst/>
+                    </a:prstGeom>
+                  </pic:spPr>
+                </pic:pic>
+              </a:graphicData>
+            </a:graphic>
+          </wp:inline>
+        </w:drawing>
+      </w:r>
+      <w:r>
+        <w:rPr>
+          <w:rFonts w:ascii="Times New Roman" w:eastAsia="Times New Roman" w:hAnsi="Times New Roman" w:cs="Times New Roman"/>
+          <w:sz w:val="24"/>
+          <w:szCs w:val="24"/>
+          <w:lang w:eastAsia="zh-CN"/>
+        </w:rPr>
+        <w:t xml:space="preserve"> </w:t>
+      </w:r>
+      <w:r>
+        <w:drawing>
+          <wp:inline distT="0" distB="0" distL="0" distR="0" wp14:anchorId="0A88D3B8" wp14:editId="28E1D12A">
+            <wp:extent cx="2559600" cy="1526400"/>
+            <wp:effectExtent l="0" t="0" r="0" b="0"/>
+            <wp:docPr id="979842040" name="Picture 6"/>
+            <wp:cNvGraphicFramePr>
+              <a:graphicFrameLocks xmlns:a="http://schemas.openxmlformats.org/drawingml/2006/main" noChangeAspect="1"/>
+            </wp:cNvGraphicFramePr>
+            <a:graphic xmlns:a="http://schemas.openxmlformats.org/drawingml/2006/main">
+              <a:graphicData uri="http://schemas.openxmlformats.org/drawingml/2006/picture">
+                <pic:pic xmlns:pic="http://schemas.openxmlformats.org/drawingml/2006/picture">
+                  <pic:nvPicPr>
+                    <pic:cNvPr id="0" name="Picture 6"/>
+                    <pic:cNvPicPr>
+                      <a:picLocks noChangeAspect="1" noChangeArrowheads="1"/>
+                    </pic:cNvPicPr>
+                  </pic:nvPicPr>
+                  <pic:blipFill>
+                    <a:blip r:embed="rId8" cstate="print">
+                      <a:extLst>
+                        <a:ext uri="{28A0092B-C50C-407E-A947-70E740481C1C}">
+                          <a14:useLocalDpi xmlns:a14="http://schemas.microsoft.com/office/drawing/2010/main" val="0"/>
+                        </a:ext>
+                      </a:extLst>
+                    </a:blip>
+                    <a:srcRect/>
+                    <a:stretch>
+                      <a:fillRect/>
+                    </a:stretch>
+                  </pic:blipFill>
+                  <pic:spPr bwMode="auto">
+                    <a:xfrm>
+                      <a:off x="0" y="0"/>
+                      <a:ext cx="2559600" cy="1526400"/>
+                    </a:xfrm>
+                    <a:prstGeom prst="rect">
+                      <a:avLst/>
+                    </a:prstGeom>
+                    <a:noFill/>
+                    <a:ln>
+                      <a:noFill/>
+                    </a:ln>
+                  </pic:spPr>
+                </pic:pic>
+              </a:graphicData>
+            </a:graphic>
+          </wp:inline>
+        </w:drawing>
       </w:r>
     </w:p>
     <w:p/>
@@ -948,7 +974,10 @@
         <w:t>Figure 4</w:t>
       </w:r>
       <w:r>
-        <w:t>, congestion by hour. Congestion varies strongly by time of day: Low congestion accounts for 100% of observations at 03:00, while High congestion reaches approximately 70.1% at 16:00. This supports the importance of hour-based features for modelling traffic conditions.</w:t>
+        <w:t xml:space="preserve">, </w:t>
+      </w:r>
+      <w:r>
+        <w:t>congestion by hour. Congestion varies strongly by time of day. Low congestion accounts for 100% of observations at 03:00, while Medium congestion is most prominent at 20:00 (approximately 93.9%), High congestion at 10:00 (approximately 85.8%), and Severe congestion at 16:00 (approximately 70.1%). This demonstrates a clear relationship between congestion level and hour of day and supports the importance of hour-based features for modelling traffic conditions.</w:t>
       </w:r>
     </w:p>
     <w:p>
@@ -994,25 +1023,15 @@
         <w:t xml:space="preserve">Each executable script uses </w:t>
       </w:r>
       <w:proofErr w:type="spellStart"/>
-      <w:proofErr w:type="gramStart"/>
       <w:r>
         <w:t>logging.getLogger</w:t>
       </w:r>
       <w:proofErr w:type="spellEnd"/>
-      <w:proofErr w:type="gramEnd"/>
       <w:r>
         <w:t xml:space="preserve">(__name__) </w:t>
       </w:r>
       <w:r>
-        <w:t xml:space="preserve">with console and file handlers and records containing timestamp, level, module and message. INFO, WARNING, DEBUG and ERROR are used for normal milestones, recoverable issues, detailed troubleshooting and failures respectively; DEBUG feature-engineering output can be enabled with --debug. Internal status messages use logging rather than </w:t>
-      </w:r>
-      <w:proofErr w:type="gramStart"/>
-      <w:r>
-        <w:t>print(</w:t>
-      </w:r>
-      <w:proofErr w:type="gramEnd"/>
-      <w:r>
-        <w:t>). Reproducibility is supported by requirements.txt, the documented execution order (pipeline.py → feature_engineering.py → visualizations.py → CLI), and the project README</w:t>
+        <w:t>with console and file handlers and records containing timestamp, level, module and message. INFO, WARNING, DEBUG and ERROR are used for normal milestones, recoverable issues, detailed troubleshooting and failures respectively; DEBUG feature-engineering output can be enabled with --debug. Internal status messages use logging rather than print(). Reproducibility is supported by requirements.txt, the documented execution order (pipeline.py → feature_engineering.py → visualizations.py → CLI), and the project README</w:t>
       </w:r>
       <w:r>
         <w:t>.</w:t>
@@ -1021,6 +1040,7 @@
     <w:p>
       <w:pPr>
         <w:pStyle w:val="Heading1"/>
+        <w:spacing w:before="120"/>
       </w:pPr>
       <w:r>
         <w:t>Limitations</w:t>
@@ -1033,6 +1053,7 @@
           <w:ilvl w:val="0"/>
           <w:numId w:val="3"/>
         </w:numPr>
+        <w:spacing w:after="0"/>
       </w:pPr>
       <w:r>
         <w:rPr>
@@ -1052,6 +1073,7 @@
           <w:ilvl w:val="0"/>
           <w:numId w:val="3"/>
         </w:numPr>
+        <w:spacing w:after="0"/>
       </w:pPr>
       <w:r>
         <w:rPr>
@@ -1061,16 +1083,25 @@
         <w:t>Dataset-relative congestion</w:t>
       </w:r>
       <w:r>
-        <w:t xml:space="preserve">: Low, Moderate and High congestion are based on dataset quartiles rather than official traffic-engineering thresholds. </w:t>
+        <w:t xml:space="preserve">: </w:t>
+      </w:r>
+      <w:r>
+        <w:t>Low, Medium, High and Severe congestion are based on dataset quartiles rather than official traffic-engineering thresholds. The categories therefore describe relative congestion within this dataset and should not be interpreted as externally validated congestion classifications</w:t>
+      </w:r>
+      <w:r>
+        <w:t xml:space="preserve">. </w:t>
       </w:r>
     </w:p>
     <w:p>
       <w:pPr>
         <w:pStyle w:val="ListParagraph"/>
+        <w:widowControl w:val="0"/>
         <w:numPr>
           <w:ilvl w:val="0"/>
           <w:numId w:val="3"/>
         </w:numPr>
+        <w:spacing w:after="0"/>
+        <w:ind w:left="714" w:hanging="357"/>
       </w:pPr>
       <w:r>
         <w:rPr>
@@ -1080,16 +1111,22 @@
         <w:t>Repeated weather observations</w:t>
       </w:r>
       <w:r>
-        <w:t xml:space="preserve">: Multiple weather records at the same timestamp were consolidated into hourly binary indicators, reducing some detail from the original records. </w:t>
+        <w:t xml:space="preserve">: </w:t>
+      </w:r>
+      <w:r>
+        <w:t>Multiple weather records at the same timestamp were consolidated into hourly binary indicators, reducing some detail from the original records.</w:t>
       </w:r>
     </w:p>
     <w:p>
       <w:pPr>
         <w:pStyle w:val="ListParagraph"/>
+        <w:widowControl w:val="0"/>
         <w:numPr>
           <w:ilvl w:val="0"/>
           <w:numId w:val="3"/>
         </w:numPr>
+        <w:spacing w:after="0"/>
+        <w:ind w:left="714" w:hanging="357"/>
       </w:pPr>
       <w:r>
         <w:rPr>
@@ -1099,7 +1136,10 @@
         <w:t>Historical recommendations</w:t>
       </w:r>
       <w:r>
-        <w:t>: The CLI recommends lower-traffic periods using historical averages and does not account for real-time traffic conditions or incidents.</w:t>
+        <w:t xml:space="preserve">: </w:t>
+      </w:r>
+      <w:r>
+        <w:t>The CLI recommends lower-traffic periods using historical averages and does not account for real-time traffic conditions or incidents.</w:t>
       </w:r>
     </w:p>
     <w:sectPr>
@@ -2343,6 +2383,19 @@
       <w:contextualSpacing/>
     </w:pPr>
   </w:style>
+  <w:style w:type="paragraph" w:styleId="NormalWeb">
+    <w:name w:val="Normal (Web)"/>
+    <w:basedOn w:val="Normal"/>
+    <w:uiPriority w:val="99"/>
+    <w:semiHidden/>
+    <w:unhideWhenUsed/>
+    <w:rsid w:val="00E67DC5"/>
+    <w:rPr>
+      <w:rFonts w:ascii="Times New Roman" w:hAnsi="Times New Roman" w:cs="Times New Roman"/>
+      <w:sz w:val="24"/>
+      <w:szCs w:val="24"/>
+    </w:rPr>
+  </w:style>
 </w:styles>
 </file>
 

</xml_diff>